<commit_message>
[DOC] - Sprint 3 documentation
</commit_message>
<xml_diff>
--- a/docs/adrs/ADRs_Resumen.docx
+++ b/docs/adrs/ADRs_Resumen.docx
@@ -24,7 +24,7 @@
           <w:noProof/>
         </w:rPr>
         <w:drawing>
-          <wp:inline distT="0" distB="0" distL="0" distR="0" wp14:anchorId="26D99145" wp14:editId="5D536A88">
+          <wp:inline distT="0" distB="0" distL="0" distR="0" wp14:anchorId="26D99145" wp14:editId="6B70BF3C">
             <wp:extent cx="5400040" cy="3980180"/>
             <wp:effectExtent l="0" t="0" r="0" b="0"/>
             <wp:docPr id="1953506445" name="Imagen 1" descr="Identidad corporativa - Universidad de Oviedo - uniovi.es"/>
@@ -419,15 +419,19 @@
         <w:pStyle w:val="Cuerpo"/>
       </w:pPr>
       <w:r>
-        <w:t xml:space="preserve">Se utilizará MariaDB para datos transaccionales (usuarios, roles, </w:t>
-      </w:r>
-      <w:proofErr w:type="spellStart"/>
-      <w:r>
-        <w:t>quizzes</w:t>
-      </w:r>
-      <w:proofErr w:type="spellEnd"/>
-      <w:r>
-        <w:t>, intentos, respuestas, puntuaciones y métricas base) y MongoDB para el banco de preguntas.</w:t>
+        <w:t>Se utilizará MariaDB para datos transaccionales (usuarios, roles</w:t>
+      </w:r>
+      <w:r>
+        <w:t xml:space="preserve"> y</w:t>
+      </w:r>
+      <w:r>
+        <w:t xml:space="preserve"> métricas base) y MongoDB para el banco de preguntas</w:t>
+      </w:r>
+      <w:r>
+        <w:t xml:space="preserve"> y cuestionarios</w:t>
+      </w:r>
+      <w:r>
+        <w:t>.</w:t>
       </w:r>
     </w:p>
     <w:p>
@@ -854,13 +858,9 @@
           <w:color w:val="0F4761" w:themeColor="accent1" w:themeShade="BF"/>
           <w:sz w:val="32"/>
           <w:szCs w:val="40"/>
-          <w:lang w:val="pt-PT"/>
         </w:rPr>
       </w:pPr>
       <w:r>
-        <w:rPr>
-          <w:lang w:val="pt-PT"/>
-        </w:rPr>
         <w:br w:type="page"/>
       </w:r>
     </w:p>

</xml_diff>

<commit_message>
[DOC] - sprint 4 documentation and ADR updates
</commit_message>
<xml_diff>
--- a/docs/adrs/ADRs_Resumen.docx
+++ b/docs/adrs/ADRs_Resumen.docx
@@ -24,7 +24,7 @@
           <w:noProof/>
         </w:rPr>
         <w:drawing>
-          <wp:inline distT="0" distB="0" distL="0" distR="0" wp14:anchorId="26D99145" wp14:editId="6B70BF3C">
+          <wp:inline distT="0" distB="0" distL="0" distR="0" wp14:anchorId="26D99145" wp14:editId="3D087C46">
             <wp:extent cx="5400040" cy="3980180"/>
             <wp:effectExtent l="0" t="0" r="0" b="0"/>
             <wp:docPr id="1953506445" name="Imagen 1" descr="Identidad corporativa - Universidad de Oviedo - uniovi.es"/>
@@ -117,7 +117,19 @@
         <w:t>Fecha:</w:t>
       </w:r>
       <w:r>
-        <w:t xml:space="preserve"> 02/03/2026</w:t>
+        <w:t xml:space="preserve"> </w:t>
+      </w:r>
+      <w:r>
+        <w:t>19</w:t>
+      </w:r>
+      <w:r>
+        <w:t>/0</w:t>
+      </w:r>
+      <w:r>
+        <w:t>4</w:t>
+      </w:r>
+      <w:r>
+        <w:t>/2026</w:t>
       </w:r>
     </w:p>
     <w:p>
@@ -1026,7 +1038,1249 @@
     <w:p>
       <w:pPr>
         <w:pStyle w:val="Cuerpo"/>
-      </w:pPr>
+        <w:rPr>
+          <w:b/>
+          <w:bCs/>
+          <w:lang w:val="en-US"/>
+        </w:rPr>
+      </w:pPr>
+    </w:p>
+    <w:p>
+      <w:pPr>
+        <w:pStyle w:val="H1"/>
+        <w:rPr>
+          <w:lang w:val="pt-PT"/>
+        </w:rPr>
+      </w:pPr>
+      <w:r>
+        <w:rPr>
+          <w:lang w:val="pt-PT"/>
+        </w:rPr>
+        <w:t xml:space="preserve">ADR-0008 — MUI </w:t>
+      </w:r>
+      <w:proofErr w:type="spellStart"/>
+      <w:r>
+        <w:rPr>
+          <w:lang w:val="pt-PT"/>
+        </w:rPr>
+        <w:t>como</w:t>
+      </w:r>
+      <w:proofErr w:type="spellEnd"/>
+      <w:r>
+        <w:rPr>
+          <w:lang w:val="pt-PT"/>
+        </w:rPr>
+        <w:t xml:space="preserve"> base de </w:t>
+      </w:r>
+      <w:proofErr w:type="spellStart"/>
+      <w:r>
+        <w:rPr>
+          <w:lang w:val="pt-PT"/>
+        </w:rPr>
+        <w:t>interfaz</w:t>
+      </w:r>
+      <w:proofErr w:type="spellEnd"/>
+    </w:p>
+    <w:p>
+      <w:pPr>
+        <w:pStyle w:val="H2"/>
+      </w:pPr>
+      <w:r>
+        <w:t>Contexto (resumen):</w:t>
+      </w:r>
+    </w:p>
+    <w:p>
+      <w:pPr>
+        <w:pStyle w:val="Cuerpo"/>
+        <w:rPr>
+          <w:lang w:val="en-US"/>
+        </w:rPr>
+      </w:pPr>
+      <w:r>
+        <w:rPr>
+          <w:lang w:val="en-US"/>
+        </w:rPr>
+        <w:t xml:space="preserve">La </w:t>
+      </w:r>
+      <w:proofErr w:type="spellStart"/>
+      <w:r>
+        <w:rPr>
+          <w:lang w:val="en-US"/>
+        </w:rPr>
+        <w:t>aplicación</w:t>
+      </w:r>
+      <w:proofErr w:type="spellEnd"/>
+      <w:r>
+        <w:rPr>
+          <w:lang w:val="en-US"/>
+        </w:rPr>
+        <w:t xml:space="preserve"> </w:t>
+      </w:r>
+      <w:proofErr w:type="spellStart"/>
+      <w:r>
+        <w:rPr>
+          <w:lang w:val="en-US"/>
+        </w:rPr>
+        <w:t>necesitaba</w:t>
+      </w:r>
+      <w:proofErr w:type="spellEnd"/>
+      <w:r>
+        <w:rPr>
+          <w:lang w:val="en-US"/>
+        </w:rPr>
+        <w:t xml:space="preserve"> </w:t>
+      </w:r>
+      <w:proofErr w:type="spellStart"/>
+      <w:r>
+        <w:rPr>
+          <w:lang w:val="en-US"/>
+        </w:rPr>
+        <w:t>una</w:t>
+      </w:r>
+      <w:proofErr w:type="spellEnd"/>
+      <w:r>
+        <w:rPr>
+          <w:lang w:val="en-US"/>
+        </w:rPr>
+        <w:t xml:space="preserve"> base de </w:t>
+      </w:r>
+      <w:proofErr w:type="spellStart"/>
+      <w:r>
+        <w:rPr>
+          <w:lang w:val="en-US"/>
+        </w:rPr>
+        <w:t>componentes</w:t>
+      </w:r>
+      <w:proofErr w:type="spellEnd"/>
+      <w:r>
+        <w:rPr>
+          <w:lang w:val="en-US"/>
+        </w:rPr>
+        <w:t xml:space="preserve"> </w:t>
+      </w:r>
+      <w:proofErr w:type="spellStart"/>
+      <w:r>
+        <w:rPr>
+          <w:lang w:val="en-US"/>
+        </w:rPr>
+        <w:t>coherente</w:t>
+      </w:r>
+      <w:proofErr w:type="spellEnd"/>
+      <w:r>
+        <w:rPr>
+          <w:lang w:val="en-US"/>
+        </w:rPr>
+        <w:t xml:space="preserve"> para </w:t>
+      </w:r>
+      <w:proofErr w:type="spellStart"/>
+      <w:r>
+        <w:rPr>
+          <w:lang w:val="en-US"/>
+        </w:rPr>
+        <w:t>formularios</w:t>
+      </w:r>
+      <w:proofErr w:type="spellEnd"/>
+      <w:r>
+        <w:rPr>
+          <w:lang w:val="en-US"/>
+        </w:rPr>
+        <w:t xml:space="preserve">, </w:t>
+      </w:r>
+      <w:proofErr w:type="spellStart"/>
+      <w:r>
+        <w:rPr>
+          <w:lang w:val="en-US"/>
+        </w:rPr>
+        <w:t>navegación</w:t>
+      </w:r>
+      <w:proofErr w:type="spellEnd"/>
+      <w:r>
+        <w:rPr>
+          <w:lang w:val="en-US"/>
+        </w:rPr>
+        <w:t xml:space="preserve">, responsive, </w:t>
+      </w:r>
+      <w:proofErr w:type="spellStart"/>
+      <w:r>
+        <w:rPr>
+          <w:lang w:val="en-US"/>
+        </w:rPr>
+        <w:t>tablas</w:t>
+      </w:r>
+      <w:proofErr w:type="spellEnd"/>
+      <w:r>
+        <w:rPr>
+          <w:lang w:val="en-US"/>
+        </w:rPr>
+        <w:t xml:space="preserve">, </w:t>
+      </w:r>
+      <w:proofErr w:type="spellStart"/>
+      <w:r>
+        <w:rPr>
+          <w:lang w:val="en-US"/>
+        </w:rPr>
+        <w:t>diálogos</w:t>
+      </w:r>
+      <w:proofErr w:type="spellEnd"/>
+      <w:r>
+        <w:rPr>
+          <w:lang w:val="en-US"/>
+        </w:rPr>
+        <w:t xml:space="preserve"> y feedback visual. </w:t>
+      </w:r>
+      <w:proofErr w:type="spellStart"/>
+      <w:r>
+        <w:rPr>
+          <w:lang w:val="en-US"/>
+        </w:rPr>
+        <w:t>Construir</w:t>
+      </w:r>
+      <w:proofErr w:type="spellEnd"/>
+      <w:r>
+        <w:rPr>
+          <w:lang w:val="en-US"/>
+        </w:rPr>
+        <w:t xml:space="preserve"> </w:t>
+      </w:r>
+      <w:proofErr w:type="spellStart"/>
+      <w:r>
+        <w:rPr>
+          <w:lang w:val="en-US"/>
+        </w:rPr>
+        <w:t>toda</w:t>
+      </w:r>
+      <w:proofErr w:type="spellEnd"/>
+      <w:r>
+        <w:rPr>
+          <w:lang w:val="en-US"/>
+        </w:rPr>
+        <w:t xml:space="preserve"> la </w:t>
+      </w:r>
+      <w:proofErr w:type="spellStart"/>
+      <w:r>
+        <w:rPr>
+          <w:lang w:val="en-US"/>
+        </w:rPr>
+        <w:t>capa</w:t>
+      </w:r>
+      <w:proofErr w:type="spellEnd"/>
+      <w:r>
+        <w:rPr>
+          <w:lang w:val="en-US"/>
+        </w:rPr>
+        <w:t xml:space="preserve"> base </w:t>
+      </w:r>
+      <w:proofErr w:type="spellStart"/>
+      <w:r>
+        <w:rPr>
+          <w:lang w:val="en-US"/>
+        </w:rPr>
+        <w:t>desde</w:t>
+      </w:r>
+      <w:proofErr w:type="spellEnd"/>
+      <w:r>
+        <w:rPr>
+          <w:lang w:val="en-US"/>
+        </w:rPr>
+        <w:t xml:space="preserve"> cero </w:t>
+      </w:r>
+      <w:proofErr w:type="spellStart"/>
+      <w:r>
+        <w:rPr>
+          <w:lang w:val="en-US"/>
+        </w:rPr>
+        <w:t>habría</w:t>
+      </w:r>
+      <w:proofErr w:type="spellEnd"/>
+      <w:r>
+        <w:rPr>
+          <w:lang w:val="en-US"/>
+        </w:rPr>
+        <w:t xml:space="preserve"> </w:t>
+      </w:r>
+      <w:proofErr w:type="spellStart"/>
+      <w:r>
+        <w:rPr>
+          <w:lang w:val="en-US"/>
+        </w:rPr>
+        <w:t>consumido</w:t>
+      </w:r>
+      <w:proofErr w:type="spellEnd"/>
+      <w:r>
+        <w:rPr>
+          <w:lang w:val="en-US"/>
+        </w:rPr>
+        <w:t xml:space="preserve"> </w:t>
+      </w:r>
+      <w:proofErr w:type="spellStart"/>
+      <w:r>
+        <w:rPr>
+          <w:lang w:val="en-US"/>
+        </w:rPr>
+        <w:t>demasiado</w:t>
+      </w:r>
+      <w:proofErr w:type="spellEnd"/>
+      <w:r>
+        <w:rPr>
+          <w:lang w:val="en-US"/>
+        </w:rPr>
+        <w:t xml:space="preserve"> </w:t>
+      </w:r>
+      <w:proofErr w:type="spellStart"/>
+      <w:r>
+        <w:rPr>
+          <w:lang w:val="en-US"/>
+        </w:rPr>
+        <w:t>tiempo</w:t>
+      </w:r>
+      <w:proofErr w:type="spellEnd"/>
+      <w:r>
+        <w:rPr>
+          <w:lang w:val="en-US"/>
+        </w:rPr>
+        <w:t xml:space="preserve"> y </w:t>
+      </w:r>
+      <w:proofErr w:type="spellStart"/>
+      <w:r>
+        <w:rPr>
+          <w:lang w:val="en-US"/>
+        </w:rPr>
+        <w:t>habría</w:t>
+      </w:r>
+      <w:proofErr w:type="spellEnd"/>
+      <w:r>
+        <w:rPr>
+          <w:lang w:val="en-US"/>
+        </w:rPr>
+        <w:t xml:space="preserve"> </w:t>
+      </w:r>
+      <w:proofErr w:type="spellStart"/>
+      <w:r>
+        <w:rPr>
+          <w:lang w:val="en-US"/>
+        </w:rPr>
+        <w:t>multiplicado</w:t>
+      </w:r>
+      <w:proofErr w:type="spellEnd"/>
+      <w:r>
+        <w:rPr>
+          <w:lang w:val="en-US"/>
+        </w:rPr>
+        <w:t xml:space="preserve"> </w:t>
+      </w:r>
+      <w:proofErr w:type="spellStart"/>
+      <w:r>
+        <w:rPr>
+          <w:lang w:val="en-US"/>
+        </w:rPr>
+        <w:t>los</w:t>
+      </w:r>
+      <w:proofErr w:type="spellEnd"/>
+      <w:r>
+        <w:rPr>
+          <w:lang w:val="en-US"/>
+        </w:rPr>
+        <w:t xml:space="preserve"> </w:t>
+      </w:r>
+      <w:proofErr w:type="spellStart"/>
+      <w:r>
+        <w:rPr>
+          <w:lang w:val="en-US"/>
+        </w:rPr>
+        <w:t>riesgos</w:t>
+      </w:r>
+      <w:proofErr w:type="spellEnd"/>
+      <w:r>
+        <w:rPr>
+          <w:lang w:val="en-US"/>
+        </w:rPr>
+        <w:t xml:space="preserve"> de </w:t>
+      </w:r>
+      <w:proofErr w:type="spellStart"/>
+      <w:r>
+        <w:rPr>
+          <w:lang w:val="en-US"/>
+        </w:rPr>
+        <w:t>inconsistencia</w:t>
+      </w:r>
+      <w:proofErr w:type="spellEnd"/>
+      <w:r>
+        <w:rPr>
+          <w:lang w:val="en-US"/>
+        </w:rPr>
+        <w:t xml:space="preserve"> visual.</w:t>
+      </w:r>
+    </w:p>
+    <w:p>
+      <w:pPr>
+        <w:pStyle w:val="H2"/>
+      </w:pPr>
+      <w:r>
+        <w:t>Decisión (resumen):</w:t>
+      </w:r>
+    </w:p>
+    <w:p>
+      <w:pPr>
+        <w:pStyle w:val="Cuerpo"/>
+        <w:rPr>
+          <w:lang w:val="en-US"/>
+        </w:rPr>
+      </w:pPr>
+      <w:r>
+        <w:rPr>
+          <w:lang w:val="en-US"/>
+        </w:rPr>
+        <w:t xml:space="preserve">Se </w:t>
+      </w:r>
+      <w:proofErr w:type="spellStart"/>
+      <w:r>
+        <w:rPr>
+          <w:lang w:val="en-US"/>
+        </w:rPr>
+        <w:t>adopta</w:t>
+      </w:r>
+      <w:proofErr w:type="spellEnd"/>
+      <w:r>
+        <w:rPr>
+          <w:lang w:val="en-US"/>
+        </w:rPr>
+        <w:t xml:space="preserve"> Material UI </w:t>
+      </w:r>
+      <w:proofErr w:type="spellStart"/>
+      <w:r>
+        <w:rPr>
+          <w:lang w:val="en-US"/>
+        </w:rPr>
+        <w:t>como</w:t>
+      </w:r>
+      <w:proofErr w:type="spellEnd"/>
+      <w:r>
+        <w:rPr>
+          <w:lang w:val="en-US"/>
+        </w:rPr>
+        <w:t xml:space="preserve"> </w:t>
+      </w:r>
+      <w:proofErr w:type="spellStart"/>
+      <w:r>
+        <w:rPr>
+          <w:lang w:val="en-US"/>
+        </w:rPr>
+        <w:t>librería</w:t>
+      </w:r>
+      <w:proofErr w:type="spellEnd"/>
+      <w:r>
+        <w:rPr>
+          <w:lang w:val="en-US"/>
+        </w:rPr>
+        <w:t xml:space="preserve"> base del frontend. La </w:t>
+      </w:r>
+      <w:proofErr w:type="spellStart"/>
+      <w:r>
+        <w:rPr>
+          <w:lang w:val="en-US"/>
+        </w:rPr>
+        <w:t>decisión</w:t>
+      </w:r>
+      <w:proofErr w:type="spellEnd"/>
+      <w:r>
+        <w:rPr>
+          <w:lang w:val="en-US"/>
+        </w:rPr>
+        <w:t xml:space="preserve"> no </w:t>
+      </w:r>
+      <w:proofErr w:type="spellStart"/>
+      <w:r>
+        <w:rPr>
+          <w:lang w:val="en-US"/>
+        </w:rPr>
+        <w:t>implica</w:t>
+      </w:r>
+      <w:proofErr w:type="spellEnd"/>
+      <w:r>
+        <w:rPr>
+          <w:lang w:val="en-US"/>
+        </w:rPr>
+        <w:t xml:space="preserve"> </w:t>
+      </w:r>
+      <w:proofErr w:type="spellStart"/>
+      <w:r>
+        <w:rPr>
+          <w:lang w:val="en-US"/>
+        </w:rPr>
+        <w:t>aceptar</w:t>
+      </w:r>
+      <w:proofErr w:type="spellEnd"/>
+      <w:r>
+        <w:rPr>
+          <w:lang w:val="en-US"/>
+        </w:rPr>
+        <w:t xml:space="preserve"> sin </w:t>
+      </w:r>
+      <w:proofErr w:type="spellStart"/>
+      <w:r>
+        <w:rPr>
+          <w:lang w:val="en-US"/>
+        </w:rPr>
+        <w:t>criterio</w:t>
+      </w:r>
+      <w:proofErr w:type="spellEnd"/>
+      <w:r>
+        <w:rPr>
+          <w:lang w:val="en-US"/>
+        </w:rPr>
+        <w:t xml:space="preserve"> </w:t>
+      </w:r>
+      <w:proofErr w:type="spellStart"/>
+      <w:r>
+        <w:rPr>
+          <w:lang w:val="en-US"/>
+        </w:rPr>
+        <w:t>el</w:t>
+      </w:r>
+      <w:proofErr w:type="spellEnd"/>
+      <w:r>
+        <w:rPr>
+          <w:lang w:val="en-US"/>
+        </w:rPr>
+        <w:t xml:space="preserve"> </w:t>
+      </w:r>
+      <w:proofErr w:type="spellStart"/>
+      <w:r>
+        <w:rPr>
+          <w:lang w:val="en-US"/>
+        </w:rPr>
+        <w:t>aspecto</w:t>
+      </w:r>
+      <w:proofErr w:type="spellEnd"/>
+      <w:r>
+        <w:rPr>
+          <w:lang w:val="en-US"/>
+        </w:rPr>
+        <w:t xml:space="preserve"> </w:t>
+      </w:r>
+      <w:proofErr w:type="spellStart"/>
+      <w:r>
+        <w:rPr>
+          <w:lang w:val="en-US"/>
+        </w:rPr>
+        <w:t>por</w:t>
+      </w:r>
+      <w:proofErr w:type="spellEnd"/>
+      <w:r>
+        <w:rPr>
+          <w:lang w:val="en-US"/>
+        </w:rPr>
+        <w:t xml:space="preserve"> </w:t>
+      </w:r>
+      <w:proofErr w:type="spellStart"/>
+      <w:r>
+        <w:rPr>
+          <w:lang w:val="en-US"/>
+        </w:rPr>
+        <w:t>defecto</w:t>
+      </w:r>
+      <w:proofErr w:type="spellEnd"/>
+      <w:r>
+        <w:rPr>
+          <w:lang w:val="en-US"/>
+        </w:rPr>
+        <w:t xml:space="preserve">, </w:t>
+      </w:r>
+      <w:proofErr w:type="spellStart"/>
+      <w:r>
+        <w:rPr>
+          <w:lang w:val="en-US"/>
+        </w:rPr>
+        <w:t>sino</w:t>
+      </w:r>
+      <w:proofErr w:type="spellEnd"/>
+      <w:r>
+        <w:rPr>
+          <w:lang w:val="en-US"/>
+        </w:rPr>
+        <w:t xml:space="preserve"> </w:t>
+      </w:r>
+      <w:proofErr w:type="spellStart"/>
+      <w:r>
+        <w:rPr>
+          <w:lang w:val="en-US"/>
+        </w:rPr>
+        <w:t>apoyarse</w:t>
+      </w:r>
+      <w:proofErr w:type="spellEnd"/>
+      <w:r>
+        <w:rPr>
+          <w:lang w:val="en-US"/>
+        </w:rPr>
+        <w:t xml:space="preserve"> </w:t>
+      </w:r>
+      <w:proofErr w:type="spellStart"/>
+      <w:r>
+        <w:rPr>
+          <w:lang w:val="en-US"/>
+        </w:rPr>
+        <w:t>en</w:t>
+      </w:r>
+      <w:proofErr w:type="spellEnd"/>
+      <w:r>
+        <w:rPr>
+          <w:lang w:val="en-US"/>
+        </w:rPr>
+        <w:t xml:space="preserve"> </w:t>
+      </w:r>
+      <w:proofErr w:type="spellStart"/>
+      <w:r>
+        <w:rPr>
+          <w:lang w:val="en-US"/>
+        </w:rPr>
+        <w:t>una</w:t>
+      </w:r>
+      <w:proofErr w:type="spellEnd"/>
+      <w:r>
+        <w:rPr>
+          <w:lang w:val="en-US"/>
+        </w:rPr>
+        <w:t xml:space="preserve"> base </w:t>
+      </w:r>
+      <w:proofErr w:type="spellStart"/>
+      <w:r>
+        <w:rPr>
+          <w:lang w:val="en-US"/>
+        </w:rPr>
+        <w:t>madura</w:t>
+      </w:r>
+      <w:proofErr w:type="spellEnd"/>
+      <w:r>
+        <w:rPr>
+          <w:lang w:val="en-US"/>
+        </w:rPr>
+        <w:t xml:space="preserve"> para </w:t>
+      </w:r>
+      <w:proofErr w:type="spellStart"/>
+      <w:r>
+        <w:rPr>
+          <w:lang w:val="en-US"/>
+        </w:rPr>
+        <w:t>acelerar</w:t>
+      </w:r>
+      <w:proofErr w:type="spellEnd"/>
+      <w:r>
+        <w:rPr>
+          <w:lang w:val="en-US"/>
+        </w:rPr>
+        <w:t xml:space="preserve"> la </w:t>
+      </w:r>
+      <w:proofErr w:type="spellStart"/>
+      <w:r>
+        <w:rPr>
+          <w:lang w:val="en-US"/>
+        </w:rPr>
+        <w:t>construcción</w:t>
+      </w:r>
+      <w:proofErr w:type="spellEnd"/>
+      <w:r>
+        <w:rPr>
+          <w:lang w:val="en-US"/>
+        </w:rPr>
+        <w:t xml:space="preserve"> de la </w:t>
+      </w:r>
+      <w:proofErr w:type="spellStart"/>
+      <w:r>
+        <w:rPr>
+          <w:lang w:val="en-US"/>
+        </w:rPr>
+        <w:t>interfaz</w:t>
+      </w:r>
+      <w:proofErr w:type="spellEnd"/>
+      <w:r>
+        <w:rPr>
+          <w:lang w:val="en-US"/>
+        </w:rPr>
+        <w:t xml:space="preserve"> y </w:t>
+      </w:r>
+      <w:proofErr w:type="spellStart"/>
+      <w:r>
+        <w:rPr>
+          <w:lang w:val="en-US"/>
+        </w:rPr>
+        <w:t>mantener</w:t>
+      </w:r>
+      <w:proofErr w:type="spellEnd"/>
+      <w:r>
+        <w:rPr>
+          <w:lang w:val="en-US"/>
+        </w:rPr>
+        <w:t xml:space="preserve"> </w:t>
+      </w:r>
+      <w:proofErr w:type="spellStart"/>
+      <w:r>
+        <w:rPr>
+          <w:lang w:val="en-US"/>
+        </w:rPr>
+        <w:t>cohesión</w:t>
+      </w:r>
+      <w:proofErr w:type="spellEnd"/>
+      <w:r>
+        <w:rPr>
+          <w:lang w:val="en-US"/>
+        </w:rPr>
+        <w:t>.</w:t>
+      </w:r>
+    </w:p>
+    <w:p>
+      <w:pPr>
+        <w:pStyle w:val="H2"/>
+      </w:pPr>
+      <w:r>
+        <w:t>Puntos clave:</w:t>
+      </w:r>
+    </w:p>
+    <w:p>
+      <w:pPr>
+        <w:pStyle w:val="ListaVietas"/>
+      </w:pPr>
+      <w:r>
+        <w:t xml:space="preserve">Esta </w:t>
+      </w:r>
+      <w:proofErr w:type="spellStart"/>
+      <w:r>
+        <w:t>decisión</w:t>
+      </w:r>
+      <w:proofErr w:type="spellEnd"/>
+      <w:r>
+        <w:t xml:space="preserve"> </w:t>
+      </w:r>
+      <w:proofErr w:type="spellStart"/>
+      <w:r>
+        <w:t>tiene</w:t>
+      </w:r>
+      <w:proofErr w:type="spellEnd"/>
+      <w:r>
+        <w:t xml:space="preserve"> </w:t>
+      </w:r>
+      <w:proofErr w:type="spellStart"/>
+      <w:r>
+        <w:t>efectos</w:t>
+      </w:r>
+      <w:proofErr w:type="spellEnd"/>
+      <w:r>
+        <w:t xml:space="preserve"> </w:t>
+      </w:r>
+      <w:proofErr w:type="spellStart"/>
+      <w:r>
+        <w:t>sobre</w:t>
+      </w:r>
+      <w:proofErr w:type="spellEnd"/>
+      <w:r>
+        <w:t xml:space="preserve"> </w:t>
+      </w:r>
+      <w:proofErr w:type="spellStart"/>
+      <w:r>
+        <w:t>arquitectura</w:t>
+      </w:r>
+      <w:proofErr w:type="spellEnd"/>
+      <w:r>
+        <w:t xml:space="preserve">, </w:t>
+      </w:r>
+      <w:proofErr w:type="spellStart"/>
+      <w:r>
+        <w:t>mantenimiento</w:t>
+      </w:r>
+      <w:proofErr w:type="spellEnd"/>
+      <w:r>
+        <w:t xml:space="preserve"> y </w:t>
+      </w:r>
+      <w:proofErr w:type="spellStart"/>
+      <w:r>
+        <w:t>documentación</w:t>
+      </w:r>
+      <w:proofErr w:type="spellEnd"/>
+      <w:r>
+        <w:t xml:space="preserve">. Los puntos </w:t>
+      </w:r>
+      <w:proofErr w:type="spellStart"/>
+      <w:r>
+        <w:t>más</w:t>
+      </w:r>
+      <w:proofErr w:type="spellEnd"/>
+      <w:r>
+        <w:t xml:space="preserve"> </w:t>
+      </w:r>
+      <w:proofErr w:type="spellStart"/>
+      <w:r>
+        <w:t>relevantes</w:t>
+      </w:r>
+      <w:proofErr w:type="spellEnd"/>
+      <w:r>
+        <w:t xml:space="preserve"> son:</w:t>
+      </w:r>
+    </w:p>
+    <w:p>
+      <w:pPr>
+        <w:pStyle w:val="ListaVietas"/>
+      </w:pPr>
+      <w:proofErr w:type="spellStart"/>
+      <w:r>
+        <w:t>Acelera</w:t>
+      </w:r>
+      <w:proofErr w:type="spellEnd"/>
+      <w:r>
+        <w:t xml:space="preserve"> la </w:t>
+      </w:r>
+      <w:proofErr w:type="spellStart"/>
+      <w:r>
+        <w:t>implementación</w:t>
+      </w:r>
+      <w:proofErr w:type="spellEnd"/>
+      <w:r>
+        <w:t xml:space="preserve"> de </w:t>
+      </w:r>
+      <w:proofErr w:type="spellStart"/>
+      <w:r>
+        <w:t>pantallas</w:t>
+      </w:r>
+      <w:proofErr w:type="spellEnd"/>
+      <w:r>
+        <w:t xml:space="preserve"> y </w:t>
+      </w:r>
+      <w:proofErr w:type="spellStart"/>
+      <w:r>
+        <w:t>formularios</w:t>
+      </w:r>
+      <w:proofErr w:type="spellEnd"/>
+      <w:r>
+        <w:t>.</w:t>
+      </w:r>
+    </w:p>
+    <w:p>
+      <w:pPr>
+        <w:pStyle w:val="ListaVietas"/>
+      </w:pPr>
+      <w:proofErr w:type="spellStart"/>
+      <w:r>
+        <w:t>Aporta</w:t>
+      </w:r>
+      <w:proofErr w:type="spellEnd"/>
+      <w:r>
+        <w:t xml:space="preserve"> </w:t>
+      </w:r>
+      <w:proofErr w:type="spellStart"/>
+      <w:r>
+        <w:t>una</w:t>
+      </w:r>
+      <w:proofErr w:type="spellEnd"/>
+      <w:r>
+        <w:t xml:space="preserve"> base de </w:t>
+      </w:r>
+      <w:proofErr w:type="spellStart"/>
+      <w:r>
+        <w:t>accesibilidad</w:t>
+      </w:r>
+      <w:proofErr w:type="spellEnd"/>
+      <w:r>
+        <w:t xml:space="preserve"> y responsive </w:t>
+      </w:r>
+      <w:proofErr w:type="spellStart"/>
+      <w:r>
+        <w:t>bastante</w:t>
+      </w:r>
+      <w:proofErr w:type="spellEnd"/>
+      <w:r>
+        <w:t xml:space="preserve"> </w:t>
+      </w:r>
+      <w:proofErr w:type="spellStart"/>
+      <w:r>
+        <w:t>probada</w:t>
+      </w:r>
+      <w:proofErr w:type="spellEnd"/>
+      <w:r>
+        <w:t>.</w:t>
+      </w:r>
+    </w:p>
+    <w:p>
+      <w:pPr>
+        <w:pStyle w:val="ListaVietas"/>
+      </w:pPr>
+      <w:r>
+        <w:t xml:space="preserve">Exige </w:t>
+      </w:r>
+      <w:proofErr w:type="spellStart"/>
+      <w:r>
+        <w:t>personalización</w:t>
+      </w:r>
+      <w:proofErr w:type="spellEnd"/>
+      <w:r>
+        <w:t xml:space="preserve"> </w:t>
+      </w:r>
+      <w:proofErr w:type="spellStart"/>
+      <w:r>
+        <w:t>suficiente</w:t>
+      </w:r>
+      <w:proofErr w:type="spellEnd"/>
+      <w:r>
+        <w:t xml:space="preserve"> para </w:t>
+      </w:r>
+      <w:proofErr w:type="spellStart"/>
+      <w:r>
+        <w:t>evitar</w:t>
+      </w:r>
+      <w:proofErr w:type="spellEnd"/>
+      <w:r>
+        <w:t xml:space="preserve"> </w:t>
+      </w:r>
+      <w:proofErr w:type="spellStart"/>
+      <w:r>
+        <w:t>una</w:t>
+      </w:r>
+      <w:proofErr w:type="spellEnd"/>
+      <w:r>
+        <w:t xml:space="preserve"> </w:t>
+      </w:r>
+      <w:proofErr w:type="spellStart"/>
+      <w:r>
+        <w:t>apariencia</w:t>
+      </w:r>
+      <w:proofErr w:type="spellEnd"/>
+      <w:r>
+        <w:t xml:space="preserve"> </w:t>
+      </w:r>
+      <w:proofErr w:type="spellStart"/>
+      <w:r>
+        <w:t>excesivamente</w:t>
+      </w:r>
+      <w:proofErr w:type="spellEnd"/>
+      <w:r>
+        <w:t xml:space="preserve"> </w:t>
+      </w:r>
+      <w:proofErr w:type="spellStart"/>
+      <w:r>
+        <w:t>genérica</w:t>
+      </w:r>
+      <w:proofErr w:type="spellEnd"/>
+      <w:r>
+        <w:t>.</w:t>
+      </w:r>
+    </w:p>
+    <w:p>
+      <w:pPr>
+        <w:pStyle w:val="Cuerpo"/>
+        <w:rPr>
+          <w:b/>
+          <w:bCs/>
+          <w:lang w:val="en-US"/>
+        </w:rPr>
+      </w:pPr>
+    </w:p>
+    <w:p>
+      <w:pPr>
+        <w:pStyle w:val="Cuerpo"/>
+        <w:rPr>
+          <w:b/>
+          <w:bCs/>
+          <w:lang w:val="en-US"/>
+        </w:rPr>
+      </w:pPr>
+    </w:p>
+    <w:p>
+      <w:pPr>
+        <w:pStyle w:val="H2"/>
+        <w:jc w:val="both"/>
+        <w:rPr>
+          <w:sz w:val="32"/>
+          <w:szCs w:val="40"/>
+        </w:rPr>
+      </w:pPr>
+      <w:r>
+        <w:rPr>
+          <w:sz w:val="32"/>
+          <w:szCs w:val="40"/>
+        </w:rPr>
+        <w:lastRenderedPageBreak/>
+        <w:t>ADR-0009 — Internacionalización del frontend con react-i18next</w:t>
+      </w:r>
+    </w:p>
+    <w:p>
+      <w:pPr>
+        <w:pStyle w:val="H2"/>
+        <w:jc w:val="both"/>
+      </w:pPr>
+      <w:r>
+        <w:t>Contexto (resumen):</w:t>
+      </w:r>
+    </w:p>
+    <w:p>
+      <w:pPr>
+        <w:pStyle w:val="H2"/>
+        <w:jc w:val="both"/>
+        <w:rPr>
+          <w:rFonts w:eastAsiaTheme="minorHAnsi" w:cstheme="minorBidi"/>
+          <w:b w:val="0"/>
+          <w:color w:val="auto"/>
+          <w:sz w:val="22"/>
+          <w:szCs w:val="24"/>
+        </w:rPr>
+      </w:pPr>
+      <w:r>
+        <w:rPr>
+          <w:rFonts w:eastAsiaTheme="minorHAnsi" w:cstheme="minorBidi"/>
+          <w:b w:val="0"/>
+          <w:color w:val="auto"/>
+          <w:sz w:val="22"/>
+          <w:szCs w:val="24"/>
+        </w:rPr>
+        <w:t>La escuela y el contexto de uso del proyecto justifican que la aplicación pueda mostrarse, al menos, en español e inglés. Posponer la internacionalización habría dejado deuda técnica repartida por todas las pantallas nuevas.</w:t>
+      </w:r>
+    </w:p>
+    <w:p>
+      <w:pPr>
+        <w:pStyle w:val="H2"/>
+        <w:jc w:val="both"/>
+      </w:pPr>
+      <w:r>
+        <w:t>Decisión (resumen):</w:t>
+      </w:r>
+    </w:p>
+    <w:p>
+      <w:pPr>
+        <w:pStyle w:val="H2"/>
+        <w:jc w:val="both"/>
+        <w:rPr>
+          <w:rFonts w:eastAsiaTheme="minorHAnsi" w:cstheme="minorBidi"/>
+          <w:b w:val="0"/>
+          <w:color w:val="auto"/>
+          <w:sz w:val="22"/>
+          <w:szCs w:val="24"/>
+        </w:rPr>
+      </w:pPr>
+      <w:r>
+        <w:rPr>
+          <w:rFonts w:eastAsiaTheme="minorHAnsi" w:cstheme="minorBidi"/>
+          <w:b w:val="0"/>
+          <w:color w:val="auto"/>
+          <w:sz w:val="22"/>
+          <w:szCs w:val="24"/>
+        </w:rPr>
+        <w:t>Se adopta react-i18next como base de i18n del frontend, con recursos separados por idioma y un selector visible de idioma. En la práctica, esta decisión empuja a sustituir textos hardcodeados por claves de traducción.</w:t>
+      </w:r>
+    </w:p>
+    <w:p>
+      <w:pPr>
+        <w:pStyle w:val="H2"/>
+        <w:jc w:val="both"/>
+      </w:pPr>
+      <w:r>
+        <w:t>Puntos clave:</w:t>
+      </w:r>
+    </w:p>
+    <w:p>
+      <w:pPr>
+        <w:pStyle w:val="Prrafodelista"/>
+        <w:numPr>
+          <w:ilvl w:val="0"/>
+          <w:numId w:val="23"/>
+        </w:numPr>
+        <w:spacing w:after="160" w:line="278" w:lineRule="auto"/>
+        <w:jc w:val="both"/>
+      </w:pPr>
+      <w:r>
+        <w:t>Mejora la escalabilidad lingüística del frontend.</w:t>
+      </w:r>
+    </w:p>
+    <w:p>
+      <w:pPr>
+        <w:pStyle w:val="Prrafodelista"/>
+        <w:numPr>
+          <w:ilvl w:val="0"/>
+          <w:numId w:val="23"/>
+        </w:numPr>
+        <w:spacing w:after="160" w:line="278" w:lineRule="auto"/>
+        <w:jc w:val="both"/>
+      </w:pPr>
+      <w:r>
+        <w:t>Reduce deuda futura en nuevas pantallas.</w:t>
+      </w:r>
+    </w:p>
+    <w:p>
+      <w:pPr>
+        <w:pStyle w:val="Prrafodelista"/>
+        <w:numPr>
+          <w:ilvl w:val="0"/>
+          <w:numId w:val="23"/>
+        </w:numPr>
+        <w:spacing w:after="160" w:line="278" w:lineRule="auto"/>
+        <w:jc w:val="both"/>
+      </w:pPr>
+      <w:r>
+        <w:t xml:space="preserve">Conviene normalizar el estado formal del ADR origen, porque el archivo actual presenta una inconsistencia entre cabecera y </w:t>
+      </w:r>
+      <w:proofErr w:type="spellStart"/>
+      <w:r>
+        <w:t>check</w:t>
+      </w:r>
+      <w:proofErr w:type="spellEnd"/>
+      <w:r>
+        <w:t xml:space="preserve"> de estado.</w:t>
+      </w:r>
+    </w:p>
+    <w:p>
+      <w:pPr>
+        <w:pStyle w:val="H2"/>
+        <w:jc w:val="both"/>
+        <w:rPr>
+          <w:sz w:val="32"/>
+          <w:szCs w:val="40"/>
+        </w:rPr>
+      </w:pPr>
+      <w:r>
+        <w:rPr>
+          <w:sz w:val="32"/>
+          <w:szCs w:val="40"/>
+        </w:rPr>
+        <w:t>ADR-0010 — Preguntas paramétricas cerradas y corrección numérica tolerante</w:t>
+      </w:r>
+    </w:p>
+    <w:p>
+      <w:pPr>
+        <w:pStyle w:val="H2"/>
+        <w:jc w:val="both"/>
+      </w:pPr>
+      <w:r>
+        <w:t>Contexto (resumen):</w:t>
+      </w:r>
+    </w:p>
+    <w:p>
+      <w:pPr>
+        <w:pStyle w:val="H2"/>
+        <w:jc w:val="both"/>
+        <w:rPr>
+          <w:rFonts w:eastAsiaTheme="minorHAnsi" w:cstheme="minorBidi"/>
+          <w:b w:val="0"/>
+          <w:color w:val="auto"/>
+          <w:sz w:val="22"/>
+          <w:szCs w:val="24"/>
+        </w:rPr>
+      </w:pPr>
+      <w:r>
+        <w:rPr>
+          <w:rFonts w:eastAsiaTheme="minorHAnsi" w:cstheme="minorBidi"/>
+          <w:b w:val="0"/>
+          <w:color w:val="auto"/>
+          <w:sz w:val="22"/>
+          <w:szCs w:val="24"/>
+        </w:rPr>
+        <w:t xml:space="preserve">La incorporación de preguntas paramétricas era funcionalmente importante, pero el TFG no podía absorber el coste de un motor simbólico general ni de un lenguaje libre de plantillas. Además, la solución debía ser asumible para profesorado no experto en </w:t>
+      </w:r>
+      <w:proofErr w:type="spellStart"/>
+      <w:r>
+        <w:rPr>
+          <w:rFonts w:eastAsiaTheme="minorHAnsi" w:cstheme="minorBidi"/>
+          <w:b w:val="0"/>
+          <w:color w:val="auto"/>
+          <w:sz w:val="22"/>
+          <w:szCs w:val="24"/>
+        </w:rPr>
+        <w:t>authoring</w:t>
+      </w:r>
+      <w:proofErr w:type="spellEnd"/>
+      <w:r>
+        <w:rPr>
+          <w:rFonts w:eastAsiaTheme="minorHAnsi" w:cstheme="minorBidi"/>
+          <w:b w:val="0"/>
+          <w:color w:val="auto"/>
+          <w:sz w:val="22"/>
+          <w:szCs w:val="24"/>
+        </w:rPr>
+        <w:t xml:space="preserve"> matemático avanzado.</w:t>
+      </w:r>
+    </w:p>
+    <w:p>
+      <w:pPr>
+        <w:pStyle w:val="H2"/>
+        <w:jc w:val="both"/>
+      </w:pPr>
+      <w:r>
+        <w:t>Decisión (resumen):</w:t>
+      </w:r>
+    </w:p>
+    <w:p>
+      <w:pPr>
+        <w:pStyle w:val="H2"/>
+        <w:jc w:val="both"/>
+        <w:rPr>
+          <w:rFonts w:eastAsiaTheme="minorHAnsi" w:cstheme="minorBidi"/>
+          <w:b w:val="0"/>
+          <w:color w:val="auto"/>
+          <w:sz w:val="22"/>
+          <w:szCs w:val="24"/>
+        </w:rPr>
+      </w:pPr>
+      <w:r>
+        <w:rPr>
+          <w:rFonts w:eastAsiaTheme="minorHAnsi" w:cstheme="minorBidi"/>
+          <w:b w:val="0"/>
+          <w:color w:val="auto"/>
+          <w:sz w:val="22"/>
+          <w:szCs w:val="24"/>
+        </w:rPr>
+        <w:t>Se adopta un modelo de familias paramétricas cerradas implementadas por el sistema, con corrección basada en evaluación numérica y tolerancia absoluta. La cantidad de variantes y la tolerancia se configuran a nivel de cuestionario, no como definición libre ilimitada de la pregunta.</w:t>
+      </w:r>
+    </w:p>
+    <w:p>
+      <w:pPr>
+        <w:pStyle w:val="H2"/>
+        <w:jc w:val="both"/>
+      </w:pPr>
+      <w:r>
+        <w:t>Puntos clave:</w:t>
+      </w:r>
+    </w:p>
+    <w:p>
+      <w:pPr>
+        <w:pStyle w:val="ListaVietas"/>
+        <w:jc w:val="both"/>
+      </w:pPr>
+      <w:r>
+        <w:t>Esta decisión tiene efectos sobre arquitectura, mantenimiento y documentación. Los puntos más relevantes son:</w:t>
+      </w:r>
+    </w:p>
+    <w:p>
+      <w:pPr>
+        <w:pStyle w:val="ListaVietas"/>
+        <w:jc w:val="both"/>
+      </w:pPr>
+      <w:r>
+        <w:t>Mantiene el alcance del TFG bajo control.</w:t>
+      </w:r>
+    </w:p>
+    <w:p>
+      <w:pPr>
+        <w:pStyle w:val="ListaVietas"/>
+        <w:jc w:val="both"/>
+      </w:pPr>
+      <w:r>
+        <w:t xml:space="preserve">Permite corrección automática explicable y </w:t>
+      </w:r>
+      <w:proofErr w:type="spellStart"/>
+      <w:r>
+        <w:t>testeable</w:t>
+      </w:r>
+      <w:proofErr w:type="spellEnd"/>
+      <w:r>
+        <w:t>.</w:t>
+      </w:r>
+    </w:p>
+    <w:p>
+      <w:pPr>
+        <w:pStyle w:val="ListaVietas"/>
+        <w:jc w:val="both"/>
+        <w:rPr>
+          <w:b/>
+          <w:bCs/>
+        </w:rPr>
+      </w:pPr>
+      <w:r>
+        <w:t>Su estado formal puede seguir figurando como Proposed en el ADR, aunque funcionalmente la decisión ya se ha materializado en el proyecto.</w:t>
+      </w:r>
     </w:p>
     <w:sectPr>
       <w:pgSz w:w="11906" w:h="16838"/>
@@ -3611,6 +4865,119 @@
     </w:lvl>
   </w:abstractNum>
   <w:abstractNum w:abstractNumId="19" w15:restartNumberingAfterBreak="0">
+    <w:nsid w:val="76027065"/>
+    <w:multiLevelType w:val="hybridMultilevel"/>
+    <w:tmpl w:val="212E6942"/>
+    <w:lvl w:ilvl="0" w:tplc="0C0A0001">
+      <w:start w:val="1"/>
+      <w:numFmt w:val="bullet"/>
+      <w:lvlText w:val=""/>
+      <w:lvlJc w:val="left"/>
+      <w:pPr>
+        <w:ind w:left="720" w:hanging="360"/>
+      </w:pPr>
+      <w:rPr>
+        <w:rFonts w:ascii="Symbol" w:hAnsi="Symbol" w:hint="default"/>
+      </w:rPr>
+    </w:lvl>
+    <w:lvl w:ilvl="1" w:tplc="0C0A0003" w:tentative="1">
+      <w:start w:val="1"/>
+      <w:numFmt w:val="bullet"/>
+      <w:lvlText w:val="o"/>
+      <w:lvlJc w:val="left"/>
+      <w:pPr>
+        <w:ind w:left="1440" w:hanging="360"/>
+      </w:pPr>
+      <w:rPr>
+        <w:rFonts w:ascii="Courier New" w:hAnsi="Courier New" w:cs="Courier New" w:hint="default"/>
+      </w:rPr>
+    </w:lvl>
+    <w:lvl w:ilvl="2" w:tplc="0C0A0005" w:tentative="1">
+      <w:start w:val="1"/>
+      <w:numFmt w:val="bullet"/>
+      <w:lvlText w:val=""/>
+      <w:lvlJc w:val="left"/>
+      <w:pPr>
+        <w:ind w:left="2160" w:hanging="360"/>
+      </w:pPr>
+      <w:rPr>
+        <w:rFonts w:ascii="Wingdings" w:hAnsi="Wingdings" w:hint="default"/>
+      </w:rPr>
+    </w:lvl>
+    <w:lvl w:ilvl="3" w:tplc="0C0A0001" w:tentative="1">
+      <w:start w:val="1"/>
+      <w:numFmt w:val="bullet"/>
+      <w:lvlText w:val=""/>
+      <w:lvlJc w:val="left"/>
+      <w:pPr>
+        <w:ind w:left="2880" w:hanging="360"/>
+      </w:pPr>
+      <w:rPr>
+        <w:rFonts w:ascii="Symbol" w:hAnsi="Symbol" w:hint="default"/>
+      </w:rPr>
+    </w:lvl>
+    <w:lvl w:ilvl="4" w:tplc="0C0A0003" w:tentative="1">
+      <w:start w:val="1"/>
+      <w:numFmt w:val="bullet"/>
+      <w:lvlText w:val="o"/>
+      <w:lvlJc w:val="left"/>
+      <w:pPr>
+        <w:ind w:left="3600" w:hanging="360"/>
+      </w:pPr>
+      <w:rPr>
+        <w:rFonts w:ascii="Courier New" w:hAnsi="Courier New" w:cs="Courier New" w:hint="default"/>
+      </w:rPr>
+    </w:lvl>
+    <w:lvl w:ilvl="5" w:tplc="0C0A0005" w:tentative="1">
+      <w:start w:val="1"/>
+      <w:numFmt w:val="bullet"/>
+      <w:lvlText w:val=""/>
+      <w:lvlJc w:val="left"/>
+      <w:pPr>
+        <w:ind w:left="4320" w:hanging="360"/>
+      </w:pPr>
+      <w:rPr>
+        <w:rFonts w:ascii="Wingdings" w:hAnsi="Wingdings" w:hint="default"/>
+      </w:rPr>
+    </w:lvl>
+    <w:lvl w:ilvl="6" w:tplc="0C0A0001" w:tentative="1">
+      <w:start w:val="1"/>
+      <w:numFmt w:val="bullet"/>
+      <w:lvlText w:val=""/>
+      <w:lvlJc w:val="left"/>
+      <w:pPr>
+        <w:ind w:left="5040" w:hanging="360"/>
+      </w:pPr>
+      <w:rPr>
+        <w:rFonts w:ascii="Symbol" w:hAnsi="Symbol" w:hint="default"/>
+      </w:rPr>
+    </w:lvl>
+    <w:lvl w:ilvl="7" w:tplc="0C0A0003" w:tentative="1">
+      <w:start w:val="1"/>
+      <w:numFmt w:val="bullet"/>
+      <w:lvlText w:val="o"/>
+      <w:lvlJc w:val="left"/>
+      <w:pPr>
+        <w:ind w:left="5760" w:hanging="360"/>
+      </w:pPr>
+      <w:rPr>
+        <w:rFonts w:ascii="Courier New" w:hAnsi="Courier New" w:cs="Courier New" w:hint="default"/>
+      </w:rPr>
+    </w:lvl>
+    <w:lvl w:ilvl="8" w:tplc="0C0A0005" w:tentative="1">
+      <w:start w:val="1"/>
+      <w:numFmt w:val="bullet"/>
+      <w:lvlText w:val=""/>
+      <w:lvlJc w:val="left"/>
+      <w:pPr>
+        <w:ind w:left="6480" w:hanging="360"/>
+      </w:pPr>
+      <w:rPr>
+        <w:rFonts w:ascii="Wingdings" w:hAnsi="Wingdings" w:hint="default"/>
+      </w:rPr>
+    </w:lvl>
+  </w:abstractNum>
+  <w:abstractNum w:abstractNumId="20" w15:restartNumberingAfterBreak="0">
     <w:nsid w:val="763510EA"/>
     <w:multiLevelType w:val="hybridMultilevel"/>
     <w:tmpl w:val="DC86B43A"/>
@@ -3724,7 +5091,7 @@
       </w:rPr>
     </w:lvl>
   </w:abstractNum>
-  <w:abstractNum w:abstractNumId="20" w15:restartNumberingAfterBreak="0">
+  <w:abstractNum w:abstractNumId="21" w15:restartNumberingAfterBreak="0">
     <w:nsid w:val="7B257FC1"/>
     <w:multiLevelType w:val="multilevel"/>
     <w:tmpl w:val="AB10F3FA"/>
@@ -3877,7 +5244,7 @@
     <w:abstractNumId w:val="3"/>
   </w:num>
   <w:num w:numId="2" w16cid:durableId="1075974540">
-    <w:abstractNumId w:val="20"/>
+    <w:abstractNumId w:val="21"/>
   </w:num>
   <w:num w:numId="3" w16cid:durableId="254411445">
     <w:abstractNumId w:val="15"/>
@@ -3934,6 +5301,12 @@
     <w:abstractNumId w:val="11"/>
   </w:num>
   <w:num w:numId="21" w16cid:durableId="1857694521">
+    <w:abstractNumId w:val="20"/>
+  </w:num>
+  <w:num w:numId="22" w16cid:durableId="755514920">
+    <w:abstractNumId w:val="12"/>
+  </w:num>
+  <w:num w:numId="23" w16cid:durableId="164246450">
     <w:abstractNumId w:val="19"/>
   </w:num>
 </w:numbering>
@@ -4550,7 +5923,6 @@
   <w:style w:type="character" w:default="1" w:styleId="Fuentedeprrafopredeter">
     <w:name w:val="Default Paragraph Font"/>
     <w:uiPriority w:val="1"/>
-    <w:semiHidden/>
     <w:unhideWhenUsed/>
   </w:style>
   <w:style w:type="table" w:default="1" w:styleId="Tablanormal">

</xml_diff>